<commit_message>
revert restyle: restore candidate's note template, patch with the four insertions only
Co-Authored-By: Claude Fable 5 <noreply@anthropic.com>
</commit_message>
<xml_diff>
--- a/deliverables/Approach-Note-Flent-FDE.docx
+++ b/deliverables/Approach-Note-Flent-FDE.docx
@@ -32,7 +32,7 @@
     </w:p>
     <w:p>
       <w:pPr>
-        <w:spacing w:before="0" w:after="240"/>
+        <w:spacing w:before="0" w:after="40"/>
       </w:pPr>
       <w:r>
         <w:rPr>
@@ -42,6 +42,82 @@
         </w:rPr>
         <w:t>Flent Forward Deployed Engineer take-home | Bangalore rental listings</w:t>
       </w:r>
+    </w:p>
+    <w:p>
+      <w:pPr>
+        <w:spacing w:before="0" w:after="40"/>
+      </w:pPr>
+      <w:r>
+        <w:rPr>
+          <w:rFonts w:ascii="Calibri" w:hAnsi="Calibri"/>
+          <w:b/>
+          <w:color w:val="1F2937"/>
+          <w:sz w:val="19"/>
+        </w:rPr>
+        <w:t>Sandeep Kumar  ·  31 August 2026</w:t>
+      </w:r>
+    </w:p>
+    <w:p>
+      <w:pPr>
+        <w:spacing w:before="0" w:after="240"/>
+      </w:pPr>
+      <w:r>
+        <w:rPr>
+          <w:rFonts w:ascii="Calibri" w:hAnsi="Calibri"/>
+          <w:color w:val="667085"/>
+          <w:sz w:val="18"/>
+        </w:rPr>
+        <w:t xml:space="preserve">Live demo: </w:t>
+      </w:r>
+      <w:hyperlink r:id="rId11">
+        <w:r>
+          <w:rPr>
+            <w:rFonts w:ascii="Calibri" w:hAnsi="Calibri"/>
+            <w:b w:val="0"/>
+            <w:color w:val="2E74B5"/>
+            <w:sz w:val="18"/>
+          </w:rPr>
+          <w:t>flent-fde-assignment.vercel.app</w:t>
+        </w:r>
+      </w:hyperlink>
+      <w:r>
+        <w:rPr>
+          <w:rFonts w:ascii="Calibri" w:hAnsi="Calibri"/>
+          <w:color w:val="667085"/>
+          <w:sz w:val="18"/>
+        </w:rPr>
+        <w:t xml:space="preserve">   ·   Code: </w:t>
+      </w:r>
+      <w:hyperlink r:id="rId12">
+        <w:r>
+          <w:rPr>
+            <w:rFonts w:ascii="Calibri" w:hAnsi="Calibri"/>
+            <w:b w:val="0"/>
+            <w:color w:val="2E74B5"/>
+            <w:sz w:val="18"/>
+          </w:rPr>
+          <w:t>github.com/sandeep-khr/Flent-FDE-take-home-assignment</w:t>
+        </w:r>
+      </w:hyperlink>
+      <w:r>
+        <w:rPr>
+          <w:rFonts w:ascii="Calibri" w:hAnsi="Calibri"/>
+          <w:color w:val="667085"/>
+          <w:sz w:val="18"/>
+        </w:rPr>
+        <w:t xml:space="preserve">   ·   Plan board: </w:t>
+      </w:r>
+      <w:hyperlink r:id="rId13">
+        <w:r>
+          <w:rPr>
+            <w:rFonts w:ascii="Calibri" w:hAnsi="Calibri"/>
+            <w:b w:val="0"/>
+            <w:color w:val="2E74B5"/>
+            <w:sz w:val="18"/>
+          </w:rPr>
+          <w:t>github.com/users/sandeep-khr/projects/1</w:t>
+        </w:r>
+      </w:hyperlink>
     </w:p>
     <w:p>
       <w:pPr>
@@ -585,7 +661,18 @@
         <w:rPr>
           <w:rFonts w:ascii="Calibri" w:hAnsi="Calibri"/>
         </w:rPr>
-        <w:t>The result is HIGH confidence under the defined ladder: the evidence comes from four platforms, has a median age of six days, and the leave-one-out swing is ₹0. Removing any one contributor does not change the median. The raw ₹59,000 result was close, but only by accident. In this packet the bad rows happen to offset one another. Cleaning still bought a known sample, a usable range, and evidence that is stable enough to challenge.</w:t>
+        <w:t>The result is HIGH confidence under the defined ladder: the evidence comes from four platforms, has a median age of six days, and the leave-one-out swing is ₹0. Removing any one contributor does not change the median. The raw ₹59,000 result was close, but only by accident. In this packet the bad rows happen to offset one another. Cleaning still bought a known sample, a usable range, and evidence that is stable enough to challenge. The same pipeline handles Flent's real volume: a labeled synthetic 27,000-row file runs end to end in under three seconds in the browser, and the page's upload box will take your own pull.</w:t>
+      </w:r>
+    </w:p>
+    <w:p>
+      <w:pPr>
+        <w:spacing w:before="0" w:after="100" w:line="264" w:lineRule="auto"/>
+      </w:pPr>
+      <w:r>
+        <w:rPr>
+          <w:rFonts w:ascii="Calibri" w:hAnsi="Calibri"/>
+        </w:rPr>
+        <w:t>An early version of my duplicate rule was too loose — it chained 31 different homes into one cluster and cut the comparison set to two rows — so the shipped rule is strict, and its near-misses go to a human instead.</w:t>
       </w:r>
     </w:p>
     <w:p>
@@ -1297,7 +1384,7 @@
         <w:rPr>
           <w:rFonts w:ascii="Calibri" w:hAnsi="Calibri"/>
         </w:rPr>
-        <w:t>I used Claude to explore the case packet, surface traps and pair-build the tested pipeline. I checked results through the tests, golden run and independent calculations. I made the choices on framing, thresholds, human review and scope. The repository includes the full AI usage log.</w:t>
+        <w:t>I used Claude to explore the case packet, surface traps, pair-build the tested pipeline, and draft this note from decisions I had already made, which I then rewrote. I checked results through the tests, golden run and independent calculations. I made the choices on framing, thresholds, human review and scope. The repository includes the full AI usage log.</w:t>
       </w:r>
     </w:p>
     <w:sectPr>

</xml_diff>